<commit_message>
refine slide3 cleaned signal response
</commit_message>
<xml_diff>
--- a/docs/project_blueprints/V5_5_SLIDE3_SIGNAL_RESPONSE_UPDATE_North_Slope_Gas_Hydrate_ML_Workflow_Companion_2026-06-17.docx
+++ b/docs/project_blueprints/V5_5_SLIDE3_SIGNAL_RESPONSE_UPDATE_North_Slope_Gas_Hydrate_ML_Workflow_Companion_2026-06-17.docx
@@ -54,7 +54,7 @@
         <w:pStyle w:val="ListBullet"/>
       </w:pPr>
       <w:r>
-        <w:t>Slide 3 now shows a depth-aligned signal-response stack: stability/BGHS context, GR, caliper QC, porosity/RHOB, Rt, Vp, Vs/mu-rho, and NMR/core move together with hydrate-compatible, free-gas-mimic, and bad-hole intervals.</w:t>
+        <w:t>Slide 3 now shows a cleaned depth-aligned signal-response stack: stability context, clean sand (GR/gamma), pore space (phi/RHOB), resistivity (Rt), P-wave speed (Vp), rigidity (Vs/mu-rho), and fluid/core checks (NMR/core) move together with hydrate-compatible and resistive-mimic intervals.</w:t>
       </w:r>
     </w:p>
     <w:p>
@@ -116,6 +116,14 @@
       </w:pPr>
       <w:r>
         <w:t>Keep S_h, S_wr, Sh, Swr, Sgh, NMR_SAT, hydrate saturation, occurrence labels, and phase labels out of X_allowed.</w:t>
+      </w:r>
+    </w:p>
+    <w:p>
+      <w:pPr>
+        <w:pStyle w:val="ListBullet"/>
+      </w:pPr>
+      <w:r>
+        <w:t>Treat Slide 3 as starting after well-log QC and washout cleanup; caliper is no longer shown as a live interpretive signal on this slide.</w:t>
       </w:r>
     </w:p>
     <w:p>
@@ -242,7 +250,7 @@
     </w:p>
     <w:p>
       <w:r>
-        <w:t>Rebuilt from the local Slide 3 signal-response source package. The slide uses a public-safe synthetic depth stack plus local CSV-derived stability and USGS public-domain log/QC references to show the interpretation ladder: stability context, clean porous host, electrical and elastic response, NMR/core calibration, and guardrails. It explicitly separates hydrate-compatible clean sand from free gas or resistive mimics and bad-hole QC, while keeping Sgh, S_h, Sh, Hydrate Saturation, NMR_SAT, Swr, and phase labels on the Y-only rail.</w:t>
+        <w:t>Rebuilt from the local Slide 3 signal-response source package after the mentor clarification that caliper washouts and bad-hole QC are already handled upstream. The slide now starts from cleaned, normalized well-log inputs and explains the ML logic in beginner-readable terms: clean sand (GR/gamma) and pore space (phi/RHOB) define a possible host, resistivity (Rt) supplies a non-unique electrical response, P-wave and S-wave rigidity (Vp, Vs/mu-rho) add broad geomechanical stiffness support, NMR means nuclear magnetic resonance fluid response, and core means sample/lab calibration. The slide separates a hydrate-compatible interval from a resistive mimic interval and keeps Sgh, S_h, Sh, Hydrate Saturation, NMR_SAT, Swr, and phase labels on the Y-only rail.</w:t>
       </w:r>
     </w:p>
     <w:p>
@@ -640,7 +648,7 @@
         <w:pStyle w:val="ListBullet"/>
       </w:pPr>
       <w:r>
-        <w:t>docs/project_blueprints/presentation_assets/slide_03_signal_response_sources_2026_06_17/ for the rebuilt Slide 3 local source package, README, source-to-visual matrix, CSV-derived stability inset, USGS public-domain log/QC crops, and public-safe signal-response template.</w:t>
+        <w:t>docs/project_blueprints/presentation_assets/slide_03_signal_response_sources_2026_06_17/ for the rebuilt Slide 3 local source package, README, source-to-visual matrix, CSV-derived methane 5 ppt stability inset, project website 2D stability map context, and public-safe signal-response template.</w:t>
       </w:r>
     </w:p>
     <w:p>
@@ -697,6 +705,14 @@
       </w:pPr>
       <w:r>
         <w:t>data/public_ml_products/source_visual_inventory_2026-06-16.csv for slide and website visual provenance.</w:t>
+      </w:r>
+    </w:p>
+    <w:p>
+      <w:pPr>
+        <w:pStyle w:val="ListBullet"/>
+      </w:pPr>
+      <w:r>
+        <w:t>Lijith, Malagar, and Singh (2019) for broad gas-hydrate geomechanics and stiffness context; Dalvand and Falahat (2021) for measured-versus-estimated Vs provenance language; USGS Fact Sheet 2019-3037 for North Slope hydrate resource context.</w:t>
       </w:r>
     </w:p>
     <w:p>

</xml_diff>